<commit_message>
feat(knowledge): ingest brain networks literature + enrich FNON framework
- Add brain_networks_literature.yaml (94 papers, 7 topic categories, landmark citations
  including Bullmore & Sporns 2009 [11,197 cit], Rubinov & Sporns 2010 [10,623 cit])
- Enrich fnon_framework.yaml with network_neuroscience_foundations block (15 landmark
  citations + 6 key principles grounding FNON in connectome/graph-theory science)
- Add _gen_brain_networks_reference.py ingestion script
- Update fnon_data JS files (adhd, alzheimers, anxiety, chronic_pain, depression,
  ocd, ptsd, stroke_rehab, tbi) with FNON protocol fields from SOZO_Brain_Networks xlsx

Co-Authored-By: Claude Sonnet 4.6 <noreply@anthropic.com>
</commit_message>
<xml_diff>
--- a/outputs/documents/adhd/partners/Clinical_Handbook_Partners_adhd.docx
+++ b/outputs/documents/adhd/partners/Clinical_Handbook_Partners_adhd.docx
@@ -11257,7 +11257,7 @@
                 <w:sz w:val="24"/>
                 <w:szCs w:val="24"/>
               </w:rPr>
-              <w:t>Classification</w:t>
+              <w:t>Regulatory</w:t>
             </w:r>
           </w:p>
         </w:tc>
@@ -11296,7 +11296,7 @@
                 <w:sz w:val="24"/>
                 <w:szCs w:val="24"/>
               </w:rPr>
-              <w:t>ADHD Status</w:t>
+              <w:t>Evidence Level</w:t>
             </w:r>
           </w:p>
         </w:tc>
@@ -11478,7 +11478,7 @@
                 <w:sz w:val="24"/>
                 <w:szCs w:val="24"/>
               </w:rPr>
-              <w:t>Investigational (Off-Label) — DLPFC/attention network modulation</w:t>
+              <w:t>RCT, Open-label</w:t>
             </w:r>
           </w:p>
         </w:tc>
@@ -11588,7 +11588,7 @@
                 <w:sz w:val="24"/>
                 <w:szCs w:val="24"/>
               </w:rPr>
-              <w:t>CE Class IIa</w:t>
+              <w:t>CE Class IIa — INVESTIGATIONAL OFF-LABEL</w:t>
             </w:r>
           </w:p>
         </w:tc>
@@ -11624,7 +11624,7 @@
                 <w:sz w:val="24"/>
                 <w:szCs w:val="24"/>
               </w:rPr>
-              <w:t>INVESTIGATIONAL (Off-Label)</w:t>
+              <w:t>Pilot RCT, Double-blind Sham-controlled</w:t>
             </w:r>
           </w:p>
         </w:tc>
@@ -11736,7 +11736,7 @@
                 <w:sz w:val="24"/>
                 <w:szCs w:val="24"/>
               </w:rPr>
-              <w:t>CE-marked</w:t>
+              <w:t>CE-marked (epilepsy/depression)</w:t>
             </w:r>
           </w:p>
         </w:tc>
@@ -11772,7 +11772,7 @@
                 <w:sz w:val="24"/>
                 <w:szCs w:val="24"/>
               </w:rPr>
-              <w:t>Emerging adjunctive — attention and arousal regulation</w:t>
+              <w:t>Open-label, Pilot</w:t>
             </w:r>
           </w:p>
         </w:tc>
@@ -11882,7 +11882,7 @@
                 <w:sz w:val="24"/>
                 <w:szCs w:val="24"/>
               </w:rPr>
-              <w:t>FDA-cleared</w:t>
+              <w:t>FDA-cleared (anxiety/insomnia/depression)</w:t>
             </w:r>
           </w:p>
         </w:tc>
@@ -11918,7 +11918,7 @@
                 <w:sz w:val="24"/>
                 <w:szCs w:val="24"/>
               </w:rPr>
-              <w:t>Investigational (Off-Label) — emotional dysregulation / sleep component</w:t>
+              <w:t>Open-label, Pilot</w:t>
             </w:r>
           </w:p>
         </w:tc>

</xml_diff>